<commit_message>
Tasks #5 & #6: v2-only preset pipeline, strict runtime, build-time validation, routes & tests
</commit_message>
<xml_diff>
--- a/zmanim_engine_project_draft.docx
+++ b/zmanim_engine_project_draft.docx
@@ -16,140 +16,6 @@
       </w:r>
       <w:r>
         <w:br/>
-      </w:r>
-      <w:r>
-        <w:fldChar w:fldCharType="begin"/>
-      </w:r>
-      <w:r>
-        <w:instrText>HYPERLINK "</w:instrText>
-      </w:r>
-      <w:r>
-        <w:instrText>https://kosherjava.com/zmanim/docs/api/com/kosherjava/zmanim/ComplexZmanimCalendar.html#method-summary</w:instrText>
-      </w:r>
-      <w:r>
-        <w:instrText>"</w:instrText>
-      </w:r>
-      <w:r>
-        <w:fldChar w:fldCharType="separate"/>
-      </w:r>
-      <w:r>
-        <w:rPr>
-          <w:rStyle w:val="Hyperlink"/>
-        </w:rPr>
-        <w:t>https://kosherjava.com/zmanim/docs/api/com/kosherjava/zmanim/ComplexZmanimCalendar.html#method-summary</w:t>
-      </w:r>
-      <w:r>
-        <w:fldChar w:fldCharType="end"/>
-      </w:r>
-    </w:p>
-    <w:p>
-      <w:pPr>
-        <w:rPr>
-          <w:b/>
-          <w:bCs/>
-        </w:rPr>
-      </w:pPr>
-      <w:r>
-        <w:br/>
-      </w:r>
-      <w:r>
-        <w:br/>
-      </w:r>
-      <w:r>
-        <w:rPr>
-          <w:b/>
-          <w:bCs/>
-        </w:rPr>
-        <w:t>Vision (what we’re building)</w:t>
-      </w:r>
-    </w:p>
-    <w:p>
-      <w:r>
-        <w:t xml:space="preserve">A Kotlin/JVM </w:t>
-      </w:r>
-      <w:r>
-        <w:rPr>
-          <w:b/>
-          <w:bCs/>
-        </w:rPr>
-        <w:t>Halachic Time Engine</w:t>
-      </w:r>
-      <w:r>
-        <w:t xml:space="preserve"> that wraps kosherjava’s ComplexZmanimCalendar, adds a flexible </w:t>
-      </w:r>
-      <w:r>
-        <w:rPr>
-          <w:b/>
-          <w:bCs/>
-        </w:rPr>
-        <w:t>Board/Profile</w:t>
-      </w:r>
-      <w:r>
-        <w:t xml:space="preserve"> system (GRA/MGA/Ba’al HaTanya/Chabad/Or HaChaim/Chazon Shamayim/Rabbeinu Tam/etc.), ships with </w:t>
-      </w:r>
-      <w:r>
-        <w:rPr>
-          <w:b/>
-          <w:bCs/>
-        </w:rPr>
-        <w:t>clear explanations &amp; sources</w:t>
-      </w:r>
-      <w:r>
-        <w:t xml:space="preserve">, and exposes </w:t>
-      </w:r>
-      <w:r>
-        <w:rPr>
-          <w:b/>
-          <w:bCs/>
-        </w:rPr>
-        <w:t>clean APIs</w:t>
-      </w:r>
-      <w:r>
-        <w:t xml:space="preserve"> for Android apps and server (REST). It will also manage holidays, parasha, hilulot, daf yomi, and special events—geo-aware with pluggable location providers.</w:t>
-      </w:r>
-    </w:p>
-    <w:p>
-      <w:pPr>
-        <w:rPr>
-          <w:b/>
-          <w:bCs/>
-        </w:rPr>
-      </w:pPr>
-      <w:r>
-        <w:rPr>
-          <w:b/>
-          <w:bCs/>
-        </w:rPr>
-        <w:t>Architecture (modules you’ll get)</w:t>
-      </w:r>
-    </w:p>
-    <w:p>
-      <w:pPr>
-        <w:numPr>
-          <w:ilvl w:val="0"/>
-          <w:numId w:val="1"/>
-        </w:numPr>
-      </w:pPr>
-      <w:r>
-        <w:rPr>
-          <w:b/>
-          <w:bCs/>
-        </w:rPr>
-        <w:t>core-engine (pure Kotlin/JVM)</w:t>
-      </w:r>
-      <w:r>
-        <w:br/>
-        <w:t>Raw calculator wrapper → ZmanResults; profile system → BoardProfile; selector → SelectedZmanim; explanations map (HE/EN); holiday/parasha/daf via JewishCalendar; hilula registry (JSON).</w:t>
-      </w:r>
-      <w:r>
-        <w:br/>
-        <w:t>Uses: kosherjava Zmanim</w:t>
-      </w:r>
-      <w:r>
-        <w:t>.</w:t>
-      </w:r>
-      <w:r>
-        <w:t xml:space="preserve"> </w:t>
       </w:r>
       <w:hyperlink r:id="rId5" w:history="1">
         <w:r>
@@ -162,6 +28,124 @@
     </w:p>
     <w:p>
       <w:pPr>
+        <w:rPr>
+          <w:b/>
+          <w:bCs/>
+        </w:rPr>
+      </w:pPr>
+      <w:r>
+        <w:br/>
+      </w:r>
+      <w:r>
+        <w:br/>
+      </w:r>
+      <w:r>
+        <w:rPr>
+          <w:b/>
+          <w:bCs/>
+        </w:rPr>
+        <w:t>Vision (what we’re building)</w:t>
+      </w:r>
+    </w:p>
+    <w:p>
+      <w:r>
+        <w:t xml:space="preserve">A Kotlin/JVM </w:t>
+      </w:r>
+      <w:r>
+        <w:rPr>
+          <w:b/>
+          <w:bCs/>
+        </w:rPr>
+        <w:t>Halachic Time Engine</w:t>
+      </w:r>
+      <w:r>
+        <w:t xml:space="preserve"> that wraps kosherjava’s ComplexZmanimCalendar, adds a flexible </w:t>
+      </w:r>
+      <w:r>
+        <w:rPr>
+          <w:b/>
+          <w:bCs/>
+        </w:rPr>
+        <w:t>Board/Profile</w:t>
+      </w:r>
+      <w:r>
+        <w:t xml:space="preserve"> system (GRA/MGA/Ba’al HaTanya/Chabad/Or HaChaim/Chazon Shamayim/Rabbeinu Tam/etc.), ships with </w:t>
+      </w:r>
+      <w:r>
+        <w:rPr>
+          <w:b/>
+          <w:bCs/>
+        </w:rPr>
+        <w:t>clear explanations &amp; sources</w:t>
+      </w:r>
+      <w:r>
+        <w:t xml:space="preserve">, and exposes </w:t>
+      </w:r>
+      <w:r>
+        <w:rPr>
+          <w:b/>
+          <w:bCs/>
+        </w:rPr>
+        <w:t>clean APIs</w:t>
+      </w:r>
+      <w:r>
+        <w:t xml:space="preserve"> for Android apps and server (REST). It will also manage holidays, parasha, hilulot, daf yomi, and special events—geo-aware with pluggable location providers.</w:t>
+      </w:r>
+    </w:p>
+    <w:p>
+      <w:pPr>
+        <w:rPr>
+          <w:b/>
+          <w:bCs/>
+        </w:rPr>
+      </w:pPr>
+      <w:r>
+        <w:rPr>
+          <w:b/>
+          <w:bCs/>
+        </w:rPr>
+        <w:t>Architecture (modules you’ll get)</w:t>
+      </w:r>
+    </w:p>
+    <w:p>
+      <w:pPr>
+        <w:numPr>
+          <w:ilvl w:val="0"/>
+          <w:numId w:val="1"/>
+        </w:numPr>
+      </w:pPr>
+      <w:r>
+        <w:rPr>
+          <w:b/>
+          <w:bCs/>
+        </w:rPr>
+        <w:t>core-engine (pure Kotlin/JVM)</w:t>
+      </w:r>
+      <w:r>
+        <w:br/>
+        <w:t>Raw calculator wrapper → ZmanResults; profile system → BoardProfile; selector → SelectedZmanim; explanations map (HE/EN); holiday/parasha/daf via JewishCalendar; hilula registry (JSON).</w:t>
+      </w:r>
+      <w:r>
+        <w:br/>
+        <w:t>Uses: kosherjava Zmanim</w:t>
+      </w:r>
+      <w:r>
+        <w:t>.</w:t>
+      </w:r>
+      <w:r>
+        <w:t xml:space="preserve"> </w:t>
+      </w:r>
+      <w:hyperlink r:id="rId6" w:anchor="method-summary" w:history="1">
+        <w:r>
+          <w:rPr>
+            <w:rStyle w:val="Hyperlink"/>
+          </w:rPr>
+          <w:t>https://kosherjava.com/zmanim/docs/api/com/kosherjava/zmanim/ComplexZmanimCalendar.html#method-summary</w:t>
+        </w:r>
+      </w:hyperlink>
+    </w:p>
+    <w:p>
+      <w:pPr>
         <w:numPr>
           <w:ilvl w:val="0"/>
           <w:numId w:val="1"/>
@@ -462,7 +446,7 @@
       <w:r>
         <w:fldChar w:fldCharType="end"/>
       </w:r>
-      <w:hyperlink r:id="rId6" w:tgtFrame="_blank" w:history="1">
+      <w:hyperlink r:id="rId7" w:tgtFrame="_blank" w:history="1">
         <w:r>
           <w:rPr>
             <w:rStyle w:val="Hyperlink"/>
@@ -635,7 +619,7 @@
       <w:r>
         <w:fldChar w:fldCharType="end"/>
       </w:r>
-      <w:hyperlink r:id="rId7" w:tgtFrame="_blank" w:history="1">
+      <w:hyperlink r:id="rId8" w:tgtFrame="_blank" w:history="1">
         <w:r>
           <w:rPr>
             <w:rStyle w:val="Hyperlink"/>
@@ -1037,7 +1021,7 @@
       <w:r>
         <w:fldChar w:fldCharType="end"/>
       </w:r>
-      <w:hyperlink r:id="rId8" w:tgtFrame="_blank" w:history="1">
+      <w:hyperlink r:id="rId9" w:tgtFrame="_blank" w:history="1">
         <w:r>
           <w:rPr>
             <w:rStyle w:val="Hyperlink"/>
@@ -1127,7 +1111,7 @@
       <w:r>
         <w:fldChar w:fldCharType="end"/>
       </w:r>
-      <w:hyperlink r:id="rId9" w:tgtFrame="_blank" w:history="1">
+      <w:hyperlink r:id="rId10" w:tgtFrame="_blank" w:history="1">
         <w:r>
           <w:rPr>
             <w:rStyle w:val="Hyperlink"/>
@@ -1345,7 +1329,7 @@
       <w:r>
         <w:t xml:space="preserve"> consistently across modules). </w:t>
       </w:r>
-      <w:hyperlink r:id="rId10" w:tgtFrame="_blank" w:history="1">
+      <w:hyperlink r:id="rId11" w:tgtFrame="_blank" w:history="1">
         <w:r>
           <w:rPr>
             <w:rStyle w:val="Hyperlink"/>
@@ -1409,6 +1393,7 @@
           <w:insideH w:val="single" w:sz="4" w:space="0" w:color="auto"/>
           <w:insideV w:val="single" w:sz="4" w:space="0" w:color="auto"/>
         </w:tblBorders>
+        <w:tblLayout w:type="fixed"/>
         <w:tblCellMar>
           <w:top w:w="15" w:type="dxa"/>
           <w:left w:w="15" w:type="dxa"/>
@@ -1430,7 +1415,7 @@
         </w:trPr>
         <w:tc>
           <w:tcPr>
-            <w:tcW w:w="0" w:type="auto"/>
+            <w:tcW w:w="5652" w:type="dxa"/>
             <w:vAlign w:val="center"/>
             <w:hideMark/>
           </w:tcPr>
@@ -1464,7 +1449,7 @@
         </w:tc>
         <w:tc>
           <w:tcPr>
-            <w:tcW w:w="0" w:type="auto"/>
+            <w:tcW w:w="1918" w:type="dxa"/>
             <w:vAlign w:val="center"/>
             <w:hideMark/>
           </w:tcPr>
@@ -1498,7 +1483,7 @@
         </w:tc>
         <w:tc>
           <w:tcPr>
-            <w:tcW w:w="0" w:type="auto"/>
+            <w:tcW w:w="1106" w:type="dxa"/>
             <w:vAlign w:val="center"/>
             <w:hideMark/>
           </w:tcPr>
@@ -1532,7 +1517,7 @@
         </w:tc>
         <w:tc>
           <w:tcPr>
-            <w:tcW w:w="0" w:type="auto"/>
+            <w:tcW w:w="524" w:type="dxa"/>
             <w:vAlign w:val="center"/>
             <w:hideMark/>
           </w:tcPr>
@@ -1571,7 +1556,7 @@
         </w:trPr>
         <w:tc>
           <w:tcPr>
-            <w:tcW w:w="0" w:type="auto"/>
+            <w:tcW w:w="5652" w:type="dxa"/>
             <w:vAlign w:val="center"/>
             <w:hideMark/>
           </w:tcPr>
@@ -1600,7 +1585,7 @@
         </w:tc>
         <w:tc>
           <w:tcPr>
-            <w:tcW w:w="0" w:type="auto"/>
+            <w:tcW w:w="1918" w:type="dxa"/>
             <w:vAlign w:val="center"/>
             <w:hideMark/>
           </w:tcPr>
@@ -1629,7 +1614,7 @@
         </w:tc>
         <w:tc>
           <w:tcPr>
-            <w:tcW w:w="0" w:type="auto"/>
+            <w:tcW w:w="1106" w:type="dxa"/>
             <w:vAlign w:val="center"/>
             <w:hideMark/>
           </w:tcPr>
@@ -1658,7 +1643,7 @@
         </w:tc>
         <w:tc>
           <w:tcPr>
-            <w:tcW w:w="0" w:type="auto"/>
+            <w:tcW w:w="524" w:type="dxa"/>
             <w:vAlign w:val="center"/>
             <w:hideMark/>
           </w:tcPr>
@@ -1692,7 +1677,7 @@
         </w:trPr>
         <w:tc>
           <w:tcPr>
-            <w:tcW w:w="0" w:type="auto"/>
+            <w:tcW w:w="5652" w:type="dxa"/>
             <w:vAlign w:val="center"/>
             <w:hideMark/>
           </w:tcPr>
@@ -1721,7 +1706,7 @@
         </w:tc>
         <w:tc>
           <w:tcPr>
-            <w:tcW w:w="0" w:type="auto"/>
+            <w:tcW w:w="1918" w:type="dxa"/>
             <w:vAlign w:val="center"/>
             <w:hideMark/>
           </w:tcPr>
@@ -1750,7 +1735,7 @@
         </w:tc>
         <w:tc>
           <w:tcPr>
-            <w:tcW w:w="0" w:type="auto"/>
+            <w:tcW w:w="1106" w:type="dxa"/>
             <w:vAlign w:val="center"/>
             <w:hideMark/>
           </w:tcPr>
@@ -1779,7 +1764,7 @@
         </w:tc>
         <w:tc>
           <w:tcPr>
-            <w:tcW w:w="0" w:type="auto"/>
+            <w:tcW w:w="524" w:type="dxa"/>
             <w:vAlign w:val="center"/>
             <w:hideMark/>
           </w:tcPr>
@@ -1813,7 +1798,7 @@
         </w:trPr>
         <w:tc>
           <w:tcPr>
-            <w:tcW w:w="0" w:type="auto"/>
+            <w:tcW w:w="5652" w:type="dxa"/>
             <w:vAlign w:val="center"/>
             <w:hideMark/>
           </w:tcPr>
@@ -1868,22 +1853,13 @@
                 <w14:ligatures w14:val="none"/>
               </w:rPr>
               <w:br/>
-            </w:r>
-            <w:r>
-              <w:rPr>
-                <w:rFonts w:ascii="Andale Mono" w:eastAsia="Times New Roman" w:hAnsi="Andale Mono" w:cs="Times New Roman"/>
-                <w:kern w:val="0"/>
-                <w:sz w:val="16"/>
-                <w:szCs w:val="16"/>
-                <w14:ligatures w14:val="none"/>
-              </w:rPr>
               <w:t>https://kosherjava.com/zmanim/docs/api/com/kosherjava/zmanim/package-summary.html</w:t>
             </w:r>
           </w:p>
         </w:tc>
         <w:tc>
           <w:tcPr>
-            <w:tcW w:w="0" w:type="auto"/>
+            <w:tcW w:w="1918" w:type="dxa"/>
             <w:vAlign w:val="center"/>
             <w:hideMark/>
           </w:tcPr>
@@ -1932,7 +1908,7 @@
         </w:tc>
         <w:tc>
           <w:tcPr>
-            <w:tcW w:w="0" w:type="auto"/>
+            <w:tcW w:w="1106" w:type="dxa"/>
             <w:vAlign w:val="center"/>
             <w:hideMark/>
           </w:tcPr>
@@ -1961,7 +1937,7 @@
         </w:tc>
         <w:tc>
           <w:tcPr>
-            <w:tcW w:w="0" w:type="auto"/>
+            <w:tcW w:w="524" w:type="dxa"/>
             <w:vAlign w:val="center"/>
             <w:hideMark/>
           </w:tcPr>
@@ -1995,7 +1971,7 @@
         </w:trPr>
         <w:tc>
           <w:tcPr>
-            <w:tcW w:w="0" w:type="auto"/>
+            <w:tcW w:w="5652" w:type="dxa"/>
             <w:vAlign w:val="center"/>
             <w:hideMark/>
           </w:tcPr>
@@ -2024,7 +2000,7 @@
         </w:tc>
         <w:tc>
           <w:tcPr>
-            <w:tcW w:w="0" w:type="auto"/>
+            <w:tcW w:w="1918" w:type="dxa"/>
             <w:vAlign w:val="center"/>
             <w:hideMark/>
           </w:tcPr>
@@ -2053,7 +2029,7 @@
         </w:tc>
         <w:tc>
           <w:tcPr>
-            <w:tcW w:w="0" w:type="auto"/>
+            <w:tcW w:w="1106" w:type="dxa"/>
             <w:vAlign w:val="center"/>
             <w:hideMark/>
           </w:tcPr>
@@ -2082,7 +2058,7 @@
         </w:tc>
         <w:tc>
           <w:tcPr>
-            <w:tcW w:w="0" w:type="auto"/>
+            <w:tcW w:w="524" w:type="dxa"/>
             <w:vAlign w:val="center"/>
           </w:tcPr>
           <w:p>
@@ -2104,7 +2080,7 @@
                 <w:szCs w:val="21"/>
                 <w14:ligatures w14:val="none"/>
               </w:rPr>
-              <w:t>WIP</w:t>
+              <w:t>Done</w:t>
             </w:r>
           </w:p>
         </w:tc>
@@ -2115,7 +2091,7 @@
         </w:trPr>
         <w:tc>
           <w:tcPr>
-            <w:tcW w:w="0" w:type="auto"/>
+            <w:tcW w:w="5652" w:type="dxa"/>
             <w:vAlign w:val="center"/>
             <w:hideMark/>
           </w:tcPr>
@@ -2144,7 +2120,7 @@
         </w:tc>
         <w:tc>
           <w:tcPr>
-            <w:tcW w:w="0" w:type="auto"/>
+            <w:tcW w:w="1918" w:type="dxa"/>
             <w:vAlign w:val="center"/>
             <w:hideMark/>
           </w:tcPr>
@@ -2173,7 +2149,7 @@
         </w:tc>
         <w:tc>
           <w:tcPr>
-            <w:tcW w:w="0" w:type="auto"/>
+            <w:tcW w:w="1106" w:type="dxa"/>
             <w:vAlign w:val="center"/>
             <w:hideMark/>
           </w:tcPr>
@@ -2202,7 +2178,7 @@
         </w:tc>
         <w:tc>
           <w:tcPr>
-            <w:tcW w:w="0" w:type="auto"/>
+            <w:tcW w:w="524" w:type="dxa"/>
             <w:vAlign w:val="center"/>
           </w:tcPr>
           <w:p>
@@ -2224,7 +2200,7 @@
                 <w:szCs w:val="21"/>
                 <w14:ligatures w14:val="none"/>
               </w:rPr>
-              <w:t>WIP</w:t>
+              <w:t>Done</w:t>
             </w:r>
           </w:p>
         </w:tc>
@@ -2235,7 +2211,7 @@
         </w:trPr>
         <w:tc>
           <w:tcPr>
-            <w:tcW w:w="0" w:type="auto"/>
+            <w:tcW w:w="5652" w:type="dxa"/>
             <w:vAlign w:val="center"/>
             <w:hideMark/>
           </w:tcPr>
@@ -2264,7 +2240,7 @@
         </w:tc>
         <w:tc>
           <w:tcPr>
-            <w:tcW w:w="0" w:type="auto"/>
+            <w:tcW w:w="1918" w:type="dxa"/>
             <w:vAlign w:val="center"/>
             <w:hideMark/>
           </w:tcPr>
@@ -2343,7 +2319,7 @@
         </w:tc>
         <w:tc>
           <w:tcPr>
-            <w:tcW w:w="0" w:type="auto"/>
+            <w:tcW w:w="1106" w:type="dxa"/>
             <w:vAlign w:val="center"/>
             <w:hideMark/>
           </w:tcPr>
@@ -2372,7 +2348,7 @@
         </w:tc>
         <w:tc>
           <w:tcPr>
-            <w:tcW w:w="0" w:type="auto"/>
+            <w:tcW w:w="524" w:type="dxa"/>
           </w:tcPr>
           <w:p>
             <w:pPr>
@@ -2404,7 +2380,7 @@
         </w:trPr>
         <w:tc>
           <w:tcPr>
-            <w:tcW w:w="0" w:type="auto"/>
+            <w:tcW w:w="5652" w:type="dxa"/>
             <w:vAlign w:val="center"/>
             <w:hideMark/>
           </w:tcPr>
@@ -2433,7 +2409,7 @@
         </w:tc>
         <w:tc>
           <w:tcPr>
-            <w:tcW w:w="0" w:type="auto"/>
+            <w:tcW w:w="1918" w:type="dxa"/>
             <w:vAlign w:val="center"/>
             <w:hideMark/>
           </w:tcPr>
@@ -2462,7 +2438,7 @@
         </w:tc>
         <w:tc>
           <w:tcPr>
-            <w:tcW w:w="0" w:type="auto"/>
+            <w:tcW w:w="1106" w:type="dxa"/>
             <w:vAlign w:val="center"/>
             <w:hideMark/>
           </w:tcPr>
@@ -2491,7 +2467,7 @@
         </w:tc>
         <w:tc>
           <w:tcPr>
-            <w:tcW w:w="0" w:type="auto"/>
+            <w:tcW w:w="524" w:type="dxa"/>
           </w:tcPr>
           <w:p>
             <w:pPr>
@@ -2523,7 +2499,7 @@
         </w:trPr>
         <w:tc>
           <w:tcPr>
-            <w:tcW w:w="0" w:type="auto"/>
+            <w:tcW w:w="5652" w:type="dxa"/>
             <w:vAlign w:val="center"/>
             <w:hideMark/>
           </w:tcPr>
@@ -2552,7 +2528,7 @@
         </w:tc>
         <w:tc>
           <w:tcPr>
-            <w:tcW w:w="0" w:type="auto"/>
+            <w:tcW w:w="1918" w:type="dxa"/>
             <w:vAlign w:val="center"/>
             <w:hideMark/>
           </w:tcPr>
@@ -2581,7 +2557,7 @@
         </w:tc>
         <w:tc>
           <w:tcPr>
-            <w:tcW w:w="0" w:type="auto"/>
+            <w:tcW w:w="1106" w:type="dxa"/>
             <w:vAlign w:val="center"/>
             <w:hideMark/>
           </w:tcPr>
@@ -2610,7 +2586,7 @@
         </w:tc>
         <w:tc>
           <w:tcPr>
-            <w:tcW w:w="0" w:type="auto"/>
+            <w:tcW w:w="524" w:type="dxa"/>
           </w:tcPr>
           <w:p>
             <w:pPr>
@@ -2642,7 +2618,7 @@
         </w:trPr>
         <w:tc>
           <w:tcPr>
-            <w:tcW w:w="0" w:type="auto"/>
+            <w:tcW w:w="5652" w:type="dxa"/>
             <w:vAlign w:val="center"/>
             <w:hideMark/>
           </w:tcPr>
@@ -2671,7 +2647,7 @@
         </w:tc>
         <w:tc>
           <w:tcPr>
-            <w:tcW w:w="0" w:type="auto"/>
+            <w:tcW w:w="1918" w:type="dxa"/>
             <w:vAlign w:val="center"/>
             <w:hideMark/>
           </w:tcPr>
@@ -2700,7 +2676,7 @@
         </w:tc>
         <w:tc>
           <w:tcPr>
-            <w:tcW w:w="0" w:type="auto"/>
+            <w:tcW w:w="1106" w:type="dxa"/>
             <w:vAlign w:val="center"/>
             <w:hideMark/>
           </w:tcPr>
@@ -2729,7 +2705,7 @@
         </w:tc>
         <w:tc>
           <w:tcPr>
-            <w:tcW w:w="0" w:type="auto"/>
+            <w:tcW w:w="524" w:type="dxa"/>
           </w:tcPr>
           <w:p>
             <w:pPr>
@@ -2761,7 +2737,7 @@
         </w:trPr>
         <w:tc>
           <w:tcPr>
-            <w:tcW w:w="0" w:type="auto"/>
+            <w:tcW w:w="5652" w:type="dxa"/>
             <w:vAlign w:val="center"/>
             <w:hideMark/>
           </w:tcPr>
@@ -2790,7 +2766,7 @@
         </w:tc>
         <w:tc>
           <w:tcPr>
-            <w:tcW w:w="0" w:type="auto"/>
+            <w:tcW w:w="1918" w:type="dxa"/>
             <w:vAlign w:val="center"/>
             <w:hideMark/>
           </w:tcPr>
@@ -2819,7 +2795,7 @@
         </w:tc>
         <w:tc>
           <w:tcPr>
-            <w:tcW w:w="0" w:type="auto"/>
+            <w:tcW w:w="1106" w:type="dxa"/>
             <w:vAlign w:val="center"/>
             <w:hideMark/>
           </w:tcPr>
@@ -2848,7 +2824,7 @@
         </w:tc>
         <w:tc>
           <w:tcPr>
-            <w:tcW w:w="0" w:type="auto"/>
+            <w:tcW w:w="524" w:type="dxa"/>
           </w:tcPr>
           <w:p>
             <w:pPr>
@@ -2880,7 +2856,7 @@
         </w:trPr>
         <w:tc>
           <w:tcPr>
-            <w:tcW w:w="0" w:type="auto"/>
+            <w:tcW w:w="5652" w:type="dxa"/>
             <w:vAlign w:val="center"/>
           </w:tcPr>
           <w:p>
@@ -2908,7 +2884,7 @@
         </w:tc>
         <w:tc>
           <w:tcPr>
-            <w:tcW w:w="0" w:type="auto"/>
+            <w:tcW w:w="1918" w:type="dxa"/>
             <w:vAlign w:val="center"/>
           </w:tcPr>
           <w:p>
@@ -2947,7 +2923,7 @@
         </w:tc>
         <w:tc>
           <w:tcPr>
-            <w:tcW w:w="0" w:type="auto"/>
+            <w:tcW w:w="1106" w:type="dxa"/>
             <w:vAlign w:val="center"/>
           </w:tcPr>
           <w:p>
@@ -2965,7 +2941,7 @@
         </w:tc>
         <w:tc>
           <w:tcPr>
-            <w:tcW w:w="0" w:type="auto"/>
+            <w:tcW w:w="524" w:type="dxa"/>
           </w:tcPr>
           <w:p>
             <w:pPr>
@@ -3057,13 +3033,8 @@
     </w:p>
     <w:p>
       <w:r>
-        <w:rPr>
-          <w:noProof/>
-        </w:rPr>
-      </w:r>
-      <w:r>
-        <w:pict w14:anchorId="20AC6D6C">
-          <v:rect id="Horizontal Line 74" o:spid="_x0000_s1033" style="width:468pt;height:.1pt;visibility:visible;mso-wrap-style:square;mso-left-percent:-10001;mso-top-percent:-10001;mso-position-horizontal:absolute;mso-position-horizontal-relative:char;mso-position-vertical:absolute;mso-position-vertical-relative:line;mso-left-percent:-10001;mso-top-percent:-10001;v-text-anchor:top" o:gfxdata="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" filled="f">
+        <w:pict w14:anchorId="1545C7FD">
+          <v:rect id="Horizontal Line 74" o:spid="_x0000_s1033" alt="" style="width:468pt;height:.1pt;visibility:visible;mso-wrap-style:square;mso-width-percent:0;mso-height-percent:0;mso-left-percent:-10001;mso-top-percent:-10001;mso-position-horizontal:absolute;mso-position-horizontal-relative:char;mso-position-vertical:absolute;mso-position-vertical-relative:line;mso-width-percent:0;mso-height-percent:0;mso-left-percent:-10001;mso-top-percent:-10001;v-text-anchor:top" filled="f">
             <o:lock v:ext="edit" rotation="t" aspectratio="t" verticies="t" text="t" shapetype="t"/>
             <w10:anchorlock/>
           </v:rect>
@@ -4130,13 +4101,8 @@
     </w:p>
     <w:p>
       <w:r>
-        <w:rPr>
-          <w:noProof/>
-        </w:rPr>
-      </w:r>
-      <w:r>
-        <w:pict w14:anchorId="471B48FB">
-          <v:rect id="Horizontal Line 80" o:spid="_x0000_s1032" style="width:468pt;height:.1pt;visibility:visible;mso-wrap-style:square;mso-left-percent:-10001;mso-top-percent:-10001;mso-position-horizontal:absolute;mso-position-horizontal-relative:char;mso-position-vertical:absolute;mso-position-vertical-relative:line;mso-left-percent:-10001;mso-top-percent:-10001;v-text-anchor:top" o:gfxdata="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" filled="f">
+        <w:pict w14:anchorId="31499567">
+          <v:rect id="Horizontal Line 80" o:spid="_x0000_s1032" alt="" style="width:468pt;height:.1pt;visibility:visible;mso-wrap-style:square;mso-width-percent:0;mso-height-percent:0;mso-left-percent:-10001;mso-top-percent:-10001;mso-position-horizontal:absolute;mso-position-horizontal-relative:char;mso-position-vertical:absolute;mso-position-vertical-relative:line;mso-width-percent:0;mso-height-percent:0;mso-left-percent:-10001;mso-top-percent:-10001;v-text-anchor:top" filled="f">
             <o:lock v:ext="edit" rotation="t" aspectratio="t" verticies="t" text="t" shapetype="t"/>
             <w10:anchorlock/>
           </v:rect>
@@ -4321,13 +4287,8 @@
     </w:p>
     <w:p>
       <w:r>
-        <w:rPr>
-          <w:noProof/>
-        </w:rPr>
-      </w:r>
-      <w:r>
-        <w:pict w14:anchorId="686EA694">
-          <v:rect id="Horizontal Line 81" o:spid="_x0000_s1031" style="width:468pt;height:.1pt;visibility:visible;mso-wrap-style:square;mso-left-percent:-10001;mso-top-percent:-10001;mso-position-horizontal:absolute;mso-position-horizontal-relative:char;mso-position-vertical:absolute;mso-position-vertical-relative:line;mso-left-percent:-10001;mso-top-percent:-10001;v-text-anchor:top" o:gfxdata="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" filled="f">
+        <w:pict w14:anchorId="6B97BDF0">
+          <v:rect id="Horizontal Line 81" o:spid="_x0000_s1031" alt="" style="width:468pt;height:.1pt;visibility:visible;mso-wrap-style:square;mso-width-percent:0;mso-height-percent:0;mso-left-percent:-10001;mso-top-percent:-10001;mso-position-horizontal:absolute;mso-position-horizontal-relative:char;mso-position-vertical:absolute;mso-position-vertical-relative:line;mso-width-percent:0;mso-height-percent:0;mso-left-percent:-10001;mso-top-percent:-10001;v-text-anchor:top" filled="f">
             <o:lock v:ext="edit" rotation="t" aspectratio="t" verticies="t" text="t" shapetype="t"/>
             <w10:anchorlock/>
           </v:rect>
@@ -4391,13 +4352,8 @@
     </w:p>
     <w:p>
       <w:r>
-        <w:rPr>
-          <w:noProof/>
-        </w:rPr>
-      </w:r>
-      <w:r>
-        <w:pict w14:anchorId="1B4EC2B6">
-          <v:rect id="Horizontal Line 82" o:spid="_x0000_s1030" style="width:468pt;height:.1pt;visibility:visible;mso-wrap-style:square;mso-left-percent:-10001;mso-top-percent:-10001;mso-position-horizontal:absolute;mso-position-horizontal-relative:char;mso-position-vertical:absolute;mso-position-vertical-relative:line;mso-left-percent:-10001;mso-top-percent:-10001;v-text-anchor:top" o:gfxdata="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" filled="f">
+        <w:pict w14:anchorId="76B2A9F8">
+          <v:rect id="Horizontal Line 82" o:spid="_x0000_s1030" alt="" style="width:468pt;height:.1pt;visibility:visible;mso-wrap-style:square;mso-width-percent:0;mso-height-percent:0;mso-left-percent:-10001;mso-top-percent:-10001;mso-position-horizontal:absolute;mso-position-horizontal-relative:char;mso-position-vertical:absolute;mso-position-vertical-relative:line;mso-width-percent:0;mso-height-percent:0;mso-left-percent:-10001;mso-top-percent:-10001;v-text-anchor:top" filled="f">
             <o:lock v:ext="edit" rotation="t" aspectratio="t" verticies="t" text="t" shapetype="t"/>
             <w10:anchorlock/>
           </v:rect>
@@ -4463,13 +4419,8 @@
     </w:p>
     <w:p>
       <w:r>
-        <w:rPr>
-          <w:noProof/>
-        </w:rPr>
-      </w:r>
-      <w:r>
-        <w:pict w14:anchorId="66507434">
-          <v:rect id="Horizontal Line 83" o:spid="_x0000_s1029" style="width:468pt;height:.1pt;visibility:visible;mso-wrap-style:square;mso-left-percent:-10001;mso-top-percent:-10001;mso-position-horizontal:absolute;mso-position-horizontal-relative:char;mso-position-vertical:absolute;mso-position-vertical-relative:line;mso-left-percent:-10001;mso-top-percent:-10001;v-text-anchor:top" o:gfxdata="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" filled="f">
+        <w:pict w14:anchorId="4DC04FC1">
+          <v:rect id="Horizontal Line 83" o:spid="_x0000_s1029" alt="" style="width:468pt;height:.1pt;visibility:visible;mso-wrap-style:square;mso-width-percent:0;mso-height-percent:0;mso-left-percent:-10001;mso-top-percent:-10001;mso-position-horizontal:absolute;mso-position-horizontal-relative:char;mso-position-vertical:absolute;mso-position-vertical-relative:line;mso-width-percent:0;mso-height-percent:0;mso-left-percent:-10001;mso-top-percent:-10001;v-text-anchor:top" filled="f">
             <o:lock v:ext="edit" rotation="t" aspectratio="t" verticies="t" text="t" shapetype="t"/>
             <w10:anchorlock/>
           </v:rect>
@@ -4795,13 +4746,8 @@
     </w:p>
     <w:p>
       <w:r>
-        <w:rPr>
-          <w:noProof/>
-        </w:rPr>
-      </w:r>
-      <w:r>
-        <w:pict w14:anchorId="391D318A">
-          <v:rect id="Horizontal Line 84" o:spid="_x0000_s1028" style="width:468pt;height:.1pt;visibility:visible;mso-wrap-style:square;mso-left-percent:-10001;mso-top-percent:-10001;mso-position-horizontal:absolute;mso-position-horizontal-relative:char;mso-position-vertical:absolute;mso-position-vertical-relative:line;mso-left-percent:-10001;mso-top-percent:-10001;v-text-anchor:top" o:gfxdata="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" filled="f">
+        <w:pict w14:anchorId="7C40C2F6">
+          <v:rect id="Horizontal Line 84" o:spid="_x0000_s1028" alt="" style="width:468pt;height:.1pt;visibility:visible;mso-wrap-style:square;mso-width-percent:0;mso-height-percent:0;mso-left-percent:-10001;mso-top-percent:-10001;mso-position-horizontal:absolute;mso-position-horizontal-relative:char;mso-position-vertical:absolute;mso-position-vertical-relative:line;mso-width-percent:0;mso-height-percent:0;mso-left-percent:-10001;mso-top-percent:-10001;v-text-anchor:top" filled="f">
             <o:lock v:ext="edit" rotation="t" aspectratio="t" verticies="t" text="t" shapetype="t"/>
             <w10:anchorlock/>
           </v:rect>
@@ -4880,17 +4826,7 @@
     </w:p>
     <w:p>
       <w:r>
-        <w:t>curl -s localhost:8080/health</w:t>
-      </w:r>
-    </w:p>
-    <w:p>
-      <w:r>
-        <w:t>curl -s localhost:8080/profiles | jq</w:t>
-      </w:r>
-    </w:p>
-    <w:p>
-      <w:r>
-        <w:t>curl -s localhost:8080/profiles/GRA | jq</w:t>
+        <w:t xml:space="preserve"> </w:t>
       </w:r>
     </w:p>
     <w:p>
@@ -4900,13 +4836,8 @@
     </w:p>
     <w:p>
       <w:r>
-        <w:rPr>
-          <w:noProof/>
-        </w:rPr>
-      </w:r>
-      <w:r>
-        <w:pict w14:anchorId="195FF3A0">
-          <v:rect id="Horizontal Line 85" o:spid="_x0000_s1027" style="width:468pt;height:.1pt;visibility:visible;mso-wrap-style:square;mso-left-percent:-10001;mso-top-percent:-10001;mso-position-horizontal:absolute;mso-position-horizontal-relative:char;mso-position-vertical:absolute;mso-position-vertical-relative:line;mso-left-percent:-10001;mso-top-percent:-10001;v-text-anchor:top" o:gfxdata="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" filled="f">
+        <w:pict w14:anchorId="58AC28CF">
+          <v:rect id="Horizontal Line 85" o:spid="_x0000_s1027" alt="" style="width:468pt;height:.1pt;visibility:visible;mso-wrap-style:square;mso-width-percent:0;mso-height-percent:0;mso-left-percent:-10001;mso-top-percent:-10001;mso-position-horizontal:absolute;mso-position-horizontal-relative:char;mso-position-vertical:absolute;mso-position-vertical-relative:line;mso-width-percent:0;mso-height-percent:0;mso-left-percent:-10001;mso-top-percent:-10001;v-text-anchor:top" filled="f">
             <o:lock v:ext="edit" rotation="t" aspectratio="t" verticies="t" text="t" shapetype="t"/>
             <w10:anchorlock/>
           </v:rect>
@@ -5002,13 +4933,8 @@
     </w:p>
     <w:p>
       <w:r>
-        <w:rPr>
-          <w:noProof/>
-        </w:rPr>
-      </w:r>
-      <w:r>
-        <w:pict w14:anchorId="39454653">
-          <v:rect id="Horizontal Line 86" o:spid="_x0000_s1026" style="width:468pt;height:.1pt;visibility:visible;mso-wrap-style:square;mso-left-percent:-10001;mso-top-percent:-10001;mso-position-horizontal:absolute;mso-position-horizontal-relative:char;mso-position-vertical:absolute;mso-position-vertical-relative:line;mso-left-percent:-10001;mso-top-percent:-10001;v-text-anchor:top" o:gfxdata="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" filled="f">
+        <w:pict w14:anchorId="44A9E816">
+          <v:rect id="Horizontal Line 86" o:spid="_x0000_s1026" alt="" style="width:468pt;height:.1pt;visibility:visible;mso-wrap-style:square;mso-width-percent:0;mso-height-percent:0;mso-left-percent:-10001;mso-top-percent:-10001;mso-position-horizontal:absolute;mso-position-horizontal-relative:char;mso-position-vertical:absolute;mso-position-vertical-relative:line;mso-width-percent:0;mso-height-percent:0;mso-left-percent:-10001;mso-top-percent:-10001;v-text-anchor:top" filled="f">
             <o:lock v:ext="edit" rotation="t" aspectratio="t" verticies="t" text="t" shapetype="t"/>
             <w10:anchorlock/>
           </v:rect>
@@ -5032,7 +4958,6 @@
         </w:numPr>
       </w:pPr>
       <w:r>
-        <w:lastRenderedPageBreak/>
         <w:t>Keep profiles human</w:t>
       </w:r>
       <w:r>
@@ -10802,6 +10727,7 @@
   <w:style w:type="character" w:default="1" w:styleId="DefaultParagraphFont">
     <w:name w:val="Default Paragraph Font"/>
     <w:uiPriority w:val="1"/>
+    <w:semiHidden/>
     <w:unhideWhenUsed/>
   </w:style>
   <w:style w:type="table" w:default="1" w:styleId="TableNormal">

</xml_diff>